<commit_message>
Rewrite developer bug report with full day's findings
Restructures into three distinct findings: (1) unchecked collection
checkboxes search unrestricted -- likely a UX issue, not a bug, since
explicit scoping worked correctly all day; (2) citation-card mismatch,
now the primary confirmed bug with 8 documented instances including
the recurring "глоссарий" anomaly on question 2.3 across two test
days; (3) reconverting documents fixed 3/3 previously "unfixable"
retrieval failures, suggesting the original 07.07.2026 ingestion
pipeline may be producing poor chunking for some files. Each section
ends with a specific question for the dev team.

Co-Authored-By: Claude Sonnet 5 <noreply@anthropic.com>
Claude-Session: https://claude.ai/code/session_01DpSN8JwCJ3tg3JVUadr2zE
</commit_message>
<xml_diff>
--- a/docs/accounts/eco/bug-report-oblast-poiska-scope.docx
+++ b/docs/accounts/eco/bug-report-oblast-poiska-scope.docx
@@ -7,7 +7,7 @@
         <w:pStyle w:val="Heading1"/>
       </w:pPr>
       <w:r>
-        <w:t>Баг-репорт: «Область поиска» не ограничивает retrieval выбранной коллекцией</w:t>
+        <w:t>Баг-репорт: находки теста на коллекции «ЭКО_2» (12.09.2026)</w:t>
       </w:r>
     </w:p>
     <w:p>
@@ -27,7 +27,7 @@
     </w:p>
     <w:p>
       <w:r>
-        <w:t>Серьёзность: высокая — блокирует текущий диагностический тест и подрывает доверие к механизму сужения поиска по коллекциям в принципе.</w:t>
+        <w:t>Статус: три отдельные находки по итогам полного дня тестирования (18 вопросов пилота, коллекции eco/ЭКО_2, агенты «Аналитик» и «Closed-book RAG»). Полный протокол со всеми скриншотами и построчными результатами — pilot-test-03-eco2-protocol.md/.docx.</w:t>
       </w:r>
     </w:p>
     <w:p>
@@ -35,138 +35,7 @@
         <w:pStyle w:val="Heading2"/>
       </w:pPr>
       <w:r>
-        <w:t>1. Кратко</w:t>
-      </w:r>
-    </w:p>
-    <w:p>
-      <w:r>
-        <w:t>Переключатель «Область поиска» → сужение до одной коллекции (в чате платформы) не ограничивает retrieval этой коллекцией на практике. Ответы продолжают цитировать документы из посторонних источников — другой коллекции того же домена и файлов, явно не относящихся к теме запроса — независимо от того, какая коллекция выбрана.</w:t>
-      </w:r>
-    </w:p>
-    <w:p>
-      <w:pPr>
-        <w:pStyle w:val="Heading2"/>
-      </w:pPr>
-      <w:r>
-        <w:t>2. Окружение</w:t>
-      </w:r>
-    </w:p>
-    <w:p>
-      <w:pPr>
-        <w:pStyle w:val="ListBullet"/>
-      </w:pPr>
-      <w:r>
-        <w:t>Домен: «Эко» (бизнес-домен ОМ), пользователь eco_user@itq-group.com, роль Domain Only Access Role.</w:t>
-      </w:r>
-    </w:p>
-    <w:p>
-      <w:pPr>
-        <w:pStyle w:val="ListBullet"/>
-      </w:pPr>
-      <w:r>
-        <w:t>Коллекции (в рамках одного домена): eco (27 документов, 494 чанка, 07.07.2026, загрузчик irina) и ЭКО_2 (27 документов, 353 чанка, создана 12.09.2026, полностью проиндексирована — статистика коллекции показывает 27/27 «Готово», 0 ошибок).</w:t>
-      </w:r>
-    </w:p>
-    <w:p>
-      <w:pPr>
-        <w:pStyle w:val="ListBullet"/>
-      </w:pPr>
-      <w:r>
-        <w:t>Область поиска в чате: «Данные (каталог и SQL)» + «Документы», сужено до одной коллекции.</w:t>
-      </w:r>
-    </w:p>
-    <w:p>
-      <w:pPr>
-        <w:pStyle w:val="Heading2"/>
-      </w:pPr>
-      <w:r>
-        <w:t>3. Шаги воспроизведения и наблюдения</w:t>
-      </w:r>
-    </w:p>
-    <w:p>
-      <w:r>
-        <w:rPr>
-          <w:b/>
-        </w:rPr>
-        <w:t>Наблюдение 1 — идентичный результат при смене коллекции.</w:t>
-      </w:r>
-    </w:p>
-    <w:p>
-      <w:r>
-        <w:t>12.09.2026, 15:06–15:07. Вопрос «Какие поля заполняет оператор после фасовки продукции?» задан дважды подряд, дословно теми же словами: первый раз область поиска сужена до ЭКО_2, второй раз — до ЭКО.</w:t>
-      </w:r>
-    </w:p>
-    <w:p>
-      <w:r>
-        <w:t>Результат идентичен в обоих случаях: тот же текст ответа, та же карточка источника — «для теста ИИ (1)/И-15-06-08 Документальное оформление продукции ОСиС.docx» (86% → 88%). ЭКО_2 и eco — разные коллекции с разным содержимым; если бы область поиска реально ограничивала retrieval, результат обязан был отличаться хотя бы путём источника.</w:t>
-      </w:r>
-    </w:p>
-    <w:p>
-      <w:r>
-        <w:rPr>
-          <w:b/>
-        </w:rPr>
-        <w:t>Наблюдение 2 — цитируется чужая коллекция, а не выбранная.</w:t>
-      </w:r>
-    </w:p>
-    <w:p>
-      <w:r>
-        <w:t>15:12, тот же день. Вопрос «Действия по корректировке Заказа на производство при выпуске продукции с меньшим весом», область поиска сужена до ЭКО_2. Ответ по существу верный, но источник — «для теста ИИ (1)/И-12-10-03 Корректировка Заказу покупателя в 1С.docx» (70%) — файл из коллекции eco, загруженный туда ещё 07.07.2026. Наш собственный файл с этим же содержанием, добавленный в ЭКО_2 в тот же день, не процитирован вообще.</w:t>
-      </w:r>
-    </w:p>
-    <w:p>
-      <w:r>
-        <w:rPr>
-          <w:b/>
-        </w:rPr>
-        <w:t>Наблюдение 3 — решающий тест: контент, которого физически нет нигде, кроме ЭКО_2.</w:t>
-      </w:r>
-    </w:p>
-    <w:p>
-      <w:r>
-        <w:t>15:35, тот же день. Задан вопрос, ответ на который гарантированно существует только в документе, добавленном в ЭКО_2 в этот же день (не мог присутствовать в коллекции eco, где самый свежий файл датирован 07.07.2026 — за два месяца до этого документа): «Что делать, если сырья на складе достаточно для наработки, но не хватает для комплектации по ФИФО?» Область поиска сужена до ЭКО_2.</w:t>
-      </w:r>
-    </w:p>
-    <w:p>
-      <w:r>
-        <w:t>Результат: «Не найдено». Источники в ответе:</w:t>
-      </w:r>
-    </w:p>
-    <w:p>
-      <w:pPr>
-        <w:pStyle w:val="ListNumber"/>
-      </w:pPr>
-      <w:r>
-        <w:t>для теста ИИ (1)/И-08-03-09 Действия при нештатных ситуациях.doc — 56%</w:t>
-      </w:r>
-    </w:p>
-    <w:p>
-      <w:pPr>
-        <w:pStyle w:val="ListNumber"/>
-      </w:pPr>
-      <w:r>
-        <w:t>Datafortest07.07 (1).xlsx — 44%</w:t>
-      </w:r>
-    </w:p>
-    <w:p>
-      <w:pPr>
-        <w:pStyle w:val="ListNumber"/>
-      </w:pPr>
-      <w:r>
-        <w:t>user_guide_skeleton.md — 43%</w:t>
-      </w:r>
-    </w:p>
-    <w:p>
-      <w:r>
-        <w:t>Ни один из трёх источников не относится к коллекции ЭКО_2, хотя релевантный контент там гарантированно есть, а сама коллекция полностью проиндексирована без ошибок (см. §2). Второй источник (Datafortest07.07.xlsx) — файл, ранее отдельно замеченный как аномалия цитирования в ре-тесте 12.09.2026 (вопрос про поля после фасовки, релевантность 64% — см. pilot-test-02-retest-protocol.md, §4). На тот момент было неясно, баг ли это отображения карточки источника или реально найденный документ. Данное наблюдение подтверждает: это реальный, retrievable файл на платформе, который систематически всплывает в выдаче по темам, никак с ним не связанным.</w:t>
-      </w:r>
-    </w:p>
-    <w:p>
-      <w:pPr>
-        <w:pStyle w:val="Heading2"/>
-      </w:pPr>
-      <w:r>
-        <w:t>4. Ожидаемое vs фактическое поведение</w:t>
+        <w:t>Сводка</w:t>
       </w:r>
     </w:p>
     <w:tbl>
@@ -176,46 +45,61 @@
         <w:tblLook w:firstColumn="1" w:firstRow="1" w:lastColumn="0" w:lastRow="0" w:noHBand="0" w:noVBand="1" w:val="04A0"/>
       </w:tblPr>
       <w:tblGrid>
-        <w:gridCol w:w="2880"/>
-        <w:gridCol w:w="2880"/>
-        <w:gridCol w:w="2880"/>
+        <w:gridCol w:w="2160"/>
+        <w:gridCol w:w="2160"/>
+        <w:gridCol w:w="2160"/>
+        <w:gridCol w:w="2160"/>
       </w:tblGrid>
       <w:tr>
         <w:tc>
           <w:tcPr>
-            <w:tcW w:type="dxa" w:w="2880"/>
+            <w:tcW w:type="dxa" w:w="2160"/>
           </w:tcPr>
           <w:p>
             <w:r>
               <w:rPr>
                 <w:b/>
               </w:rPr>
+              <w:t>№</w:t>
             </w:r>
           </w:p>
         </w:tc>
         <w:tc>
           <w:tcPr>
-            <w:tcW w:type="dxa" w:w="2880"/>
+            <w:tcW w:type="dxa" w:w="2160"/>
           </w:tcPr>
           <w:p>
             <w:r>
               <w:rPr>
                 <w:b/>
               </w:rPr>
-              <w:t>Ожидаемое</w:t>
+              <w:t>Находка</w:t>
             </w:r>
           </w:p>
         </w:tc>
         <w:tc>
           <w:tcPr>
-            <w:tcW w:type="dxa" w:w="2880"/>
+            <w:tcW w:type="dxa" w:w="2160"/>
           </w:tcPr>
           <w:p>
             <w:r>
               <w:rPr>
                 <w:b/>
               </w:rPr>
-              <w:t>Фактическое</w:t>
+              <w:t>Статус</w:t>
+            </w:r>
+          </w:p>
+        </w:tc>
+        <w:tc>
+          <w:tcPr>
+            <w:tcW w:type="dxa" w:w="2160"/>
+          </w:tcPr>
+          <w:p>
+            <w:r>
+              <w:rPr>
+                <w:b/>
+              </w:rPr>
+              <w:t>Серьёзность</w:t>
             </w:r>
           </w:p>
         </w:tc>
@@ -223,31 +107,41 @@
       <w:tr>
         <w:tc>
           <w:tcPr>
-            <w:tcW w:type="dxa" w:w="2880"/>
+            <w:tcW w:type="dxa" w:w="2160"/>
           </w:tcPr>
           <w:p>
             <w:r>
-              <w:t>Сужение области поиска до ЭКО_2</w:t>
+              <w:t>1</w:t>
             </w:r>
           </w:p>
         </w:tc>
         <w:tc>
           <w:tcPr>
-            <w:tcW w:type="dxa" w:w="2880"/>
+            <w:tcW w:type="dxa" w:w="2160"/>
           </w:tcPr>
           <w:p>
             <w:r>
-              <w:t>Retrieval ограничен документами коллекции ЭКО_2</w:t>
+              <w:t>«Область поиска» без отмеченной коллекции ищет везде</w:t>
             </w:r>
           </w:p>
         </w:tc>
         <w:tc>
           <w:tcPr>
-            <w:tcW w:type="dxa" w:w="2880"/>
+            <w:tcW w:type="dxa" w:w="2160"/>
           </w:tcPr>
           <w:p>
             <w:r>
-              <w:t>Retrieval продолжает возвращать документы из eco и, судя по всему, других не связанных с доменом источников (Datafortest07.07.xlsx, user_guide_skeleton.md)</w:t>
+              <w:t>Вероятно не баг, а недостаток UX — нужно подтверждение</w:t>
+            </w:r>
+          </w:p>
+        </w:tc>
+        <w:tc>
+          <w:tcPr>
+            <w:tcW w:type="dxa" w:w="2160"/>
+          </w:tcPr>
+          <w:p>
+            <w:r>
+              <w:t>Средняя</w:t>
             </w:r>
           </w:p>
         </w:tc>
@@ -255,31 +149,41 @@
       <w:tr>
         <w:tc>
           <w:tcPr>
-            <w:tcW w:type="dxa" w:w="2880"/>
+            <w:tcW w:type="dxa" w:w="2160"/>
           </w:tcPr>
           <w:p>
             <w:r>
-              <w:t>Смена коллекции в области поиска (ЭКО_2 → ЭКО) при одном и том же вопросе</w:t>
+              <w:t>2</w:t>
             </w:r>
           </w:p>
         </w:tc>
         <w:tc>
           <w:tcPr>
-            <w:tcW w:type="dxa" w:w="2880"/>
+            <w:tcW w:type="dxa" w:w="2160"/>
           </w:tcPr>
           <w:p>
             <w:r>
-              <w:t>Результат/источники меняются, если содержимое коллекций различается</w:t>
+              <w:t>Карточка источника не совпадает с текстом ответа</w:t>
             </w:r>
           </w:p>
         </w:tc>
         <w:tc>
           <w:tcPr>
-            <w:tcW w:type="dxa" w:w="2880"/>
+            <w:tcW w:type="dxa" w:w="2160"/>
           </w:tcPr>
           <w:p>
             <w:r>
-              <w:t>Результат и источник идентичны</w:t>
+              <w:t>Подтверждённый баг, воспроизводится системно</w:t>
+            </w:r>
+          </w:p>
+        </w:tc>
+        <w:tc>
+          <w:tcPr>
+            <w:tcW w:type="dxa" w:w="2160"/>
+          </w:tcPr>
+          <w:p>
+            <w:r>
+              <w:t>Высокая</w:t>
             </w:r>
           </w:p>
         </w:tc>
@@ -287,31 +191,41 @@
       <w:tr>
         <w:tc>
           <w:tcPr>
-            <w:tcW w:type="dxa" w:w="2880"/>
+            <w:tcW w:type="dxa" w:w="2160"/>
           </w:tcPr>
           <w:p>
             <w:r>
-              <w:t>Контент, добавленный только в ЭКО_2</w:t>
+              <w:t>3</w:t>
             </w:r>
           </w:p>
         </w:tc>
         <w:tc>
           <w:tcPr>
-            <w:tcW w:type="dxa" w:w="2880"/>
+            <w:tcW w:type="dxa" w:w="2160"/>
           </w:tcPr>
           <w:p>
             <w:r>
-              <w:t>Должен находиться, когда область поиска сужена до ЭКО_2</w:t>
+              <w:t>Переконвертация документов чинит «неразрешимые» ошибки retrieval</w:t>
             </w:r>
           </w:p>
         </w:tc>
         <w:tc>
           <w:tcPr>
-            <w:tcW w:type="dxa" w:w="2880"/>
+            <w:tcW w:type="dxa" w:w="2160"/>
           </w:tcPr>
           <w:p>
             <w:r>
-              <w:t>Не найден; топ-3 источника не из ЭКО_2</w:t>
+              <w:t>Не баг, а диагностическая находка о пайплайне обработки</w:t>
+            </w:r>
+          </w:p>
+        </w:tc>
+        <w:tc>
+          <w:tcPr>
+            <w:tcW w:type="dxa" w:w="2160"/>
+          </w:tcPr>
+          <w:p>
+            <w:r>
+              <w:t>Информационная, но важная</w:t>
             </w:r>
           </w:p>
         </w:tc>
@@ -322,7 +236,600 @@
         <w:pStyle w:val="Heading2"/>
       </w:pPr>
       <w:r>
-        <w:t>5. Гипотезы о причине (для проверки разработчиком)</w:t>
+        <w:t>Находка 1 — «Область поиска» без отмеченной коллекции ищет по всем источникам</w:t>
+      </w:r>
+    </w:p>
+    <w:p>
+      <w:pPr>
+        <w:pStyle w:val="Heading3"/>
+      </w:pPr>
+      <w:r>
+        <w:t>Начальные наблюдения (15:06–15:35)</w:t>
+      </w:r>
+    </w:p>
+    <w:p>
+      <w:r>
+        <w:t>Один и тот же вопрос («Какие поля заполняет оператор после фасовки продукции?») задан с областью поиска, попеременно сужаемой до ЭКО_2 и до ЭКО — результат и источник были идентичны в обоих случаях (для теста ИИ (1)/И-15-06-08...docx, 86%→88%). Позже, в 15:35, вопрос с ответом, гарантированно уникальным для ЭКО_2 (документ загружен в этот же день), дал «не найдено» с тремя посторонними источниками, ни один — не из ЭКО_2.</w:t>
+      </w:r>
+    </w:p>
+    <w:p>
+      <w:pPr>
+        <w:pStyle w:val="Heading3"/>
+      </w:pPr>
+      <w:r>
+        <w:t>Объяснение, найденное позже (18:49)</w:t>
+      </w:r>
+    </w:p>
+    <w:p>
+      <w:r>
+        <w:t>Скриншот попапа «Где искать» показал: в блоке «КОЛЛЕКЦИИ» ни ЭКО_2, ни ЭКО не были отмечены чекбоксом, а подпись внизу гласит: «Данные и документы — все разрешённые источники». То есть при пустых чекбоксах коллекций поиск идёт по всем источникам без ограничения — вероятно, именно это и произошло в наблюдениях 15:06–15:35 (хотя для того момента отдельного скриншота настроек не сохранилось, это ретроспективная, а не подтверждённая на месте гипотеза).</w:t>
+      </w:r>
+    </w:p>
+    <w:p>
+      <w:pPr>
+        <w:pStyle w:val="Heading3"/>
+      </w:pPr>
+      <w:r>
+        <w:t>Подтверждение того, что при явном выборе коллекции всё работает</w:t>
+      </w:r>
+    </w:p>
+    <w:p>
+      <w:r>
+        <w:t>Позже в тот же день, с явно подтверждённым скриншотом «Где искать» (только «Документы», коллекция ЭКО отмечена, ЭКО_2 — нет), результаты стабильно и правильно ограничивались коллекцией ЭКО на протяжении всех 18 вопросов пилота (см. pilot-test-03-eco2-protocol.md, §1b). При целевых перепроверках с явным переключением на ЭКО_2 источники менялись на файлы из ЭКО_2 корректно (см. там же, §1c: вопросы 2.2, 3.2, 5.2, 6.2).</w:t>
+      </w:r>
+    </w:p>
+    <w:p>
+      <w:pPr>
+        <w:pStyle w:val="Heading3"/>
+      </w:pPr>
+      <w:r>
+        <w:t>Вывод</w:t>
+      </w:r>
+    </w:p>
+    <w:p>
+      <w:r>
+        <w:t>Похоже, это не баг retrieval-фильтрации как таковой, а особенность интерфейса: незаполненные чекбоксы коллекций трактуются как «искать везде», без явного индикатора этого состояния в чате (только мелкая подпись в попапе настроек, легко упустить). Это создаёт риск: пользователь предполагает, что область сужена, хотя чекбоксы не отмечены, и получает нерепрезентативный результат, не понимая почему.</w:t>
+      </w:r>
+    </w:p>
+    <w:p>
+      <w:r>
+        <w:rPr>
+          <w:b/>
+        </w:rPr>
+        <w:t xml:space="preserve">Вопрос к разработчику: </w:t>
+      </w:r>
+      <w:r>
+        <w:t>подтвердить, что это ожидаемое поведение (не баг), и рассмотреть более явную индикацию в самом чате (не только в попапе), когда поиск не ограничен ни одной коллекцией — например, бейдж «Поиск без ограничения по коллекциям» рядом с полем ввода.</w:t>
+      </w:r>
+    </w:p>
+    <w:p>
+      <w:pPr>
+        <w:pStyle w:val="Heading2"/>
+      </w:pPr>
+      <w:r>
+        <w:t>Находка 2 — карточка источника систематически не совпадает с текстом ответа</w:t>
+      </w:r>
+    </w:p>
+    <w:p>
+      <w:r>
+        <w:rPr>
+          <w:b/>
+        </w:rPr>
+        <w:t xml:space="preserve">Это главная, надёжно подтверждённая находка дня. </w:t>
+      </w:r>
+      <w:r>
+        <w:t>За один прогон 18 вопросов (12.09, 18:27–19:34) карточка источника не совпадала с документом, реально процитированным в тексте ответа, минимум 8 раз — независимо от того, был ли сам текстовый ответ верным, и независимо от агента/коллекции:</w:t>
+      </w:r>
+    </w:p>
+    <w:tbl>
+      <w:tblPr>
+        <w:tblStyle w:val="TableGrid"/>
+        <w:tblW w:type="auto" w:w="0"/>
+        <w:tblLook w:firstColumn="1" w:firstRow="1" w:lastColumn="0" w:lastRow="0" w:noHBand="0" w:noVBand="1" w:val="04A0"/>
+      </w:tblPr>
+      <w:tblGrid>
+        <w:gridCol w:w="2160"/>
+        <w:gridCol w:w="2160"/>
+        <w:gridCol w:w="2160"/>
+        <w:gridCol w:w="2160"/>
+      </w:tblGrid>
+      <w:tr>
+        <w:tc>
+          <w:tcPr>
+            <w:tcW w:type="dxa" w:w="2160"/>
+          </w:tcPr>
+          <w:p>
+            <w:r>
+              <w:rPr>
+                <w:b/>
+              </w:rPr>
+              <w:t>Вопрос</w:t>
+            </w:r>
+          </w:p>
+        </w:tc>
+        <w:tc>
+          <w:tcPr>
+            <w:tcW w:type="dxa" w:w="2160"/>
+          </w:tcPr>
+          <w:p>
+            <w:r>
+              <w:rPr>
+                <w:b/>
+              </w:rPr>
+              <w:t>Время</w:t>
+            </w:r>
+          </w:p>
+        </w:tc>
+        <w:tc>
+          <w:tcPr>
+            <w:tcW w:type="dxa" w:w="2160"/>
+          </w:tcPr>
+          <w:p>
+            <w:r>
+              <w:rPr>
+                <w:b/>
+              </w:rPr>
+              <w:t>Текст называет</w:t>
+            </w:r>
+          </w:p>
+        </w:tc>
+        <w:tc>
+          <w:tcPr>
+            <w:tcW w:type="dxa" w:w="2160"/>
+          </w:tcPr>
+          <w:p>
+            <w:r>
+              <w:rPr>
+                <w:b/>
+              </w:rPr>
+              <w:t>Карточка показывает</w:t>
+            </w:r>
+          </w:p>
+        </w:tc>
+      </w:tr>
+      <w:tr>
+        <w:tc>
+          <w:tcPr>
+            <w:tcW w:type="dxa" w:w="2160"/>
+          </w:tcPr>
+          <w:p>
+            <w:r>
+              <w:t>1.3 (на ЭКО_2)</w:t>
+            </w:r>
+          </w:p>
+        </w:tc>
+        <w:tc>
+          <w:tcPr>
+            <w:tcW w:type="dxa" w:w="2160"/>
+          </w:tcPr>
+          <w:p>
+            <w:r>
+              <w:t>18:40</w:t>
+            </w:r>
+          </w:p>
+        </w:tc>
+        <w:tc>
+          <w:tcPr>
+            <w:tcW w:type="dxa" w:w="2160"/>
+          </w:tcPr>
+          <w:p>
+            <w:r>
+              <w:t>И-16-01-11 (наш файл ЭКО_2)</w:t>
+            </w:r>
+          </w:p>
+        </w:tc>
+        <w:tc>
+          <w:tcPr>
+            <w:tcW w:type="dxa" w:w="2160"/>
+          </w:tcPr>
+          <w:p>
+            <w:r>
+              <w:t>«глоссарий», 100%</w:t>
+            </w:r>
+          </w:p>
+        </w:tc>
+      </w:tr>
+      <w:tr>
+        <w:tc>
+          <w:tcPr>
+            <w:tcW w:type="dxa" w:w="2160"/>
+          </w:tcPr>
+          <w:p>
+            <w:r>
+              <w:t>2.1</w:t>
+            </w:r>
+          </w:p>
+        </w:tc>
+        <w:tc>
+          <w:tcPr>
+            <w:tcW w:type="dxa" w:w="2160"/>
+          </w:tcPr>
+          <w:p>
+            <w:r>
+              <w:t>18:43</w:t>
+            </w:r>
+          </w:p>
+        </w:tc>
+        <w:tc>
+          <w:tcPr>
+            <w:tcW w:type="dxa" w:w="2160"/>
+          </w:tcPr>
+          <w:p>
+            <w:r>
+              <w:t>И-08-02-10</w:t>
+            </w:r>
+          </w:p>
+        </w:tc>
+        <w:tc>
+          <w:tcPr>
+            <w:tcW w:type="dxa" w:w="2160"/>
+          </w:tcPr>
+          <w:p>
+            <w:r>
+              <w:t>И-15-06-08 (другой документ)</w:t>
+            </w:r>
+          </w:p>
+        </w:tc>
+      </w:tr>
+      <w:tr>
+        <w:tc>
+          <w:tcPr>
+            <w:tcW w:type="dxa" w:w="2160"/>
+          </w:tcPr>
+          <w:p>
+            <w:r>
+              <w:t>2.3</w:t>
+            </w:r>
+          </w:p>
+        </w:tc>
+        <w:tc>
+          <w:tcPr>
+            <w:tcW w:type="dxa" w:w="2160"/>
+          </w:tcPr>
+          <w:p>
+            <w:r>
+              <w:t>18:48</w:t>
+            </w:r>
+          </w:p>
+        </w:tc>
+        <w:tc>
+          <w:tcPr>
+            <w:tcW w:type="dxa" w:w="2160"/>
+          </w:tcPr>
+          <w:p>
+            <w:r>
+              <w:t>Методика №38</w:t>
+            </w:r>
+          </w:p>
+        </w:tc>
+        <w:tc>
+          <w:tcPr>
+            <w:tcW w:type="dxa" w:w="2160"/>
+          </w:tcPr>
+          <w:p>
+            <w:r>
+              <w:t>«глоссарий», 100%</w:t>
+            </w:r>
+          </w:p>
+        </w:tc>
+      </w:tr>
+      <w:tr>
+        <w:tc>
+          <w:tcPr>
+            <w:tcW w:type="dxa" w:w="2160"/>
+          </w:tcPr>
+          <w:p>
+            <w:r>
+              <w:t>2.3 (повтор, скоуп подтверждён)</w:t>
+            </w:r>
+          </w:p>
+        </w:tc>
+        <w:tc>
+          <w:tcPr>
+            <w:tcW w:type="dxa" w:w="2160"/>
+          </w:tcPr>
+          <w:p>
+            <w:r>
+              <w:t>18:52</w:t>
+            </w:r>
+          </w:p>
+        </w:tc>
+        <w:tc>
+          <w:tcPr>
+            <w:tcW w:type="dxa" w:w="2160"/>
+          </w:tcPr>
+          <w:p>
+            <w:r>
+              <w:t>Методика №38</w:t>
+            </w:r>
+          </w:p>
+        </w:tc>
+        <w:tc>
+          <w:tcPr>
+            <w:tcW w:type="dxa" w:w="2160"/>
+          </w:tcPr>
+          <w:p>
+            <w:r>
+              <w:t>«глоссарий», 100% — опять</w:t>
+            </w:r>
+          </w:p>
+        </w:tc>
+      </w:tr>
+      <w:tr>
+        <w:tc>
+          <w:tcPr>
+            <w:tcW w:type="dxa" w:w="2160"/>
+          </w:tcPr>
+          <w:p>
+            <w:r>
+              <w:t>4.3</w:t>
+            </w:r>
+          </w:p>
+        </w:tc>
+        <w:tc>
+          <w:tcPr>
+            <w:tcW w:type="dxa" w:w="2160"/>
+          </w:tcPr>
+          <w:p>
+            <w:r>
+              <w:t>19:07</w:t>
+            </w:r>
+          </w:p>
+        </w:tc>
+        <w:tc>
+          <w:tcPr>
+            <w:tcW w:type="dxa" w:w="2160"/>
+          </w:tcPr>
+          <w:p>
+            <w:r>
+              <w:t>И-08-04-13</w:t>
+            </w:r>
+          </w:p>
+        </w:tc>
+        <w:tc>
+          <w:tcPr>
+            <w:tcW w:type="dxa" w:w="2160"/>
+          </w:tcPr>
+          <w:p>
+            <w:r>
+              <w:t>Д-11-06-01 и ПР-03-00-12 (оба неверные)</w:t>
+            </w:r>
+          </w:p>
+        </w:tc>
+      </w:tr>
+      <w:tr>
+        <w:tc>
+          <w:tcPr>
+            <w:tcW w:type="dxa" w:w="2160"/>
+          </w:tcPr>
+          <w:p>
+            <w:r>
+              <w:t>5.1</w:t>
+            </w:r>
+          </w:p>
+        </w:tc>
+        <w:tc>
+          <w:tcPr>
+            <w:tcW w:type="dxa" w:w="2160"/>
+          </w:tcPr>
+          <w:p>
+            <w:r>
+              <w:t>19:22</w:t>
+            </w:r>
+          </w:p>
+        </w:tc>
+        <w:tc>
+          <w:tcPr>
+            <w:tcW w:type="dxa" w:w="2160"/>
+          </w:tcPr>
+          <w:p>
+            <w:r>
+              <w:t>ПР-09-00-14 + ПР-03-00-12</w:t>
+            </w:r>
+          </w:p>
+        </w:tc>
+        <w:tc>
+          <w:tcPr>
+            <w:tcW w:type="dxa" w:w="2160"/>
+          </w:tcPr>
+          <w:p>
+            <w:r>
+              <w:t>только ПР-03-00-12 (второй не показан)</w:t>
+            </w:r>
+          </w:p>
+        </w:tc>
+      </w:tr>
+      <w:tr>
+        <w:tc>
+          <w:tcPr>
+            <w:tcW w:type="dxa" w:w="2160"/>
+          </w:tcPr>
+          <w:p>
+            <w:r>
+              <w:t>5.2 (фикс на ЭКО_2)</w:t>
+            </w:r>
+          </w:p>
+        </w:tc>
+        <w:tc>
+          <w:tcPr>
+            <w:tcW w:type="dxa" w:w="2160"/>
+          </w:tcPr>
+          <w:p>
+            <w:r>
+              <w:t>19:14</w:t>
+            </w:r>
+          </w:p>
+        </w:tc>
+        <w:tc>
+          <w:tcPr>
+            <w:tcW w:type="dxa" w:w="2160"/>
+          </w:tcPr>
+          <w:p>
+            <w:r>
+              <w:t>ПР-10(02)-00 (наш файл ЭКО_2)</w:t>
+            </w:r>
+          </w:p>
+        </w:tc>
+        <w:tc>
+          <w:tcPr>
+            <w:tcW w:type="dxa" w:w="2160"/>
+          </w:tcPr>
+          <w:p>
+            <w:r>
+              <w:t>Д-17-12-03 (другой документ)</w:t>
+            </w:r>
+          </w:p>
+        </w:tc>
+      </w:tr>
+      <w:tr>
+        <w:tc>
+          <w:tcPr>
+            <w:tcW w:type="dxa" w:w="2160"/>
+          </w:tcPr>
+          <w:p>
+            <w:r>
+              <w:t>6.3</w:t>
+            </w:r>
+          </w:p>
+        </w:tc>
+        <w:tc>
+          <w:tcPr>
+            <w:tcW w:type="dxa" w:w="2160"/>
+          </w:tcPr>
+          <w:p>
+            <w:r>
+              <w:t>19:25</w:t>
+            </w:r>
+          </w:p>
+        </w:tc>
+        <w:tc>
+          <w:tcPr>
+            <w:tcW w:type="dxa" w:w="2160"/>
+          </w:tcPr>
+          <w:p>
+            <w:r>
+              <w:t>ПР-09-00-14 + ПР-03-00-12</w:t>
+            </w:r>
+          </w:p>
+        </w:tc>
+        <w:tc>
+          <w:tcPr>
+            <w:tcW w:type="dxa" w:w="2160"/>
+          </w:tcPr>
+          <w:p>
+            <w:r>
+              <w:t>блок карточек полностью пуст</w:t>
+            </w:r>
+          </w:p>
+        </w:tc>
+      </w:tr>
+    </w:tbl>
+    <w:p>
+      <w:pPr>
+        <w:pStyle w:val="Heading3"/>
+      </w:pPr>
+      <w:r>
+        <w:t>Особый случай — вопрос про высоту сброса тары (2.3) и «глоссарий»</w:t>
+      </w:r>
+    </w:p>
+    <w:p>
+      <w:r>
+        <w:t>Этот конкретный вопрос дважды сегодня и один раз 12.09 (в предыдущем ре-тесте) показал карточку «глоссарий», 100% — три раза подряд на одном и том же вопросе, с разными агентами/днями/текстами ответа. Это самый надёжно воспроизводимый случай аномалии, вероятно, удобная отправная точка для разработчика.</w:t>
+      </w:r>
+    </w:p>
+    <w:p>
+      <w:pPr>
+        <w:pStyle w:val="Heading3"/>
+      </w:pPr>
+      <w:r>
+        <w:t>Техническая зацепка</w:t>
+      </w:r>
+    </w:p>
+    <w:p>
+      <w:r>
+        <w:t>В интерфейсе несколько раз всплывало системное сообщение: «Документ «глоссарий» недоступен» — при попытке открыть карточку. Если сам документ «глоссарий» повреждён, отсутствует или является каким-то пустым/служебным плейсхолдером, это может объяснять аномалию: битый или вырожденный embedding такого документа способен патологически «притягивать» высокий скор совпадения (100%) независимо от содержания запроса.</w:t>
+      </w:r>
+    </w:p>
+    <w:p>
+      <w:r>
+        <w:t>Отдельно подтверждено (по полному списку документов коллекции eco, см. Приложение в pilot-test-03-eco2-protocol.md): файла с названием «глоссарий» среди 27 документов «для теста ИИ (1)» нет вообще — источник этой аномалии физически находится за пределами проверяемой коллекции/папки.</w:t>
+      </w:r>
+    </w:p>
+    <w:p>
+      <w:pPr>
+        <w:pStyle w:val="Heading3"/>
+      </w:pPr>
+      <w:r>
+        <w:t xml:space="preserve">Вывод </w:t>
+      </w:r>
+    </w:p>
+    <w:p>
+      <w:r>
+        <w:t>Карточка источника — ненадёжный индикатор происхождения ответа. Пользователь, доверяющий карточке буквально (не сверяя её с цитатами в самом тексте), может сделать неверные выводы о том, откуда на самом деле взялся ответ — риск для доверия к системе цитирования в целом.</w:t>
+      </w:r>
+    </w:p>
+    <w:p>
+      <w:r>
+        <w:rPr>
+          <w:b/>
+        </w:rPr>
+        <w:t xml:space="preserve">Вопрос к разработчику: </w:t>
+      </w:r>
+      <w:r>
+        <w:t>это баг рендеринга карточки (берёт не тот chunk/документ при формировании UI) или реальная ошибка retrieval (в контекст модели действительно попадает другой документ, просто текст модель формулирует по своим знаниям)? Разница критична для диагностики и доверия к самим текстовым ответам, не только к карточкам.</w:t>
+      </w:r>
+    </w:p>
+    <w:p>
+      <w:pPr>
+        <w:pStyle w:val="Heading2"/>
+      </w:pPr>
+      <w:r>
+        <w:t>Находка 3 — переконвертация документов чинит ранее «неразрешимые» ошибки retrieval</w:t>
+      </w:r>
+    </w:p>
+    <w:p>
+      <w:r>
+        <w:t>Не баг, а важная диагностическая находка, обнаруженная в ходе того же теста.</w:t>
+      </w:r>
+    </w:p>
+    <w:p>
+      <w:r>
+        <w:t>Три вопроса пилота (5.2 — приоритет заявок на ремонт, 6.2 — добавление Спецификации в 1С-8, 2.2 — корректировка Заказа на производство) систематически проваливались на исходной коллекции eco во всех трёх раундах тестирования (11.09, 12.09, и снова сегодня) — при том что нужные документы физически присутствовали в корпусе eco/для теста ИИ (1). До сегодняшнего дня 5.2 считался «контрольным случаем чистой retrieval-ошибки, не связанной с форматом», потому что исходный файл был читаемым .docx.</w:t>
+      </w:r>
+    </w:p>
+    <w:p>
+      <w:r>
+        <w:t>Сегодня те же три вопроса были заданы на коллекции ЭКО_2, куда мы загрузили те же документы, но пересобранные заново через собственный пайплайн (catdoc для .doc + python-docx, переразбивка на абзацы, единый новый файл — см. README.md, раздел «converted-for-upload»). Все три вопроса дали полные, верные ответы с точными ссылками на нужные документы (eco-converted-for-upload/...), без единого исключения (n=3 из 3).</w:t>
+      </w:r>
+    </w:p>
+    <w:p>
+      <w:r>
+        <w:rPr>
+          <w:b/>
+        </w:rPr>
+        <w:t xml:space="preserve">Рабочая гипотеза: </w:t>
+      </w:r>
+      <w:r>
+        <w:t>проблема была не в «неразрешимой» ошибке retrieval как таковой, а в качестве чанкования/эмбеддинга конкретных файлов при их первой обработке (загрузка irina, 07.07.2026, пайплайн обработки на тот момент неизвестен) — возможно, из-за особенностей исходного форматирования (таблицы, стили), которые платформа некорректно разбила на чанки. Переконвертация этих же документов через более простой, «плоский» пайплайн, похоже, случайно дала более качественное чанкование.</w:t>
+      </w:r>
+    </w:p>
+    <w:p>
+      <w:r>
+        <w:rPr>
+          <w:b/>
+        </w:rPr>
+        <w:t xml:space="preserve">Вопрос к разработчику: </w:t>
+      </w:r>
+      <w:r>
+        <w:t>если гипотеза верна — стоит проверить, чем отличается обработка исходных версий этих трёх файлов от переконвертированных (chunk-границы, эмбеддинги), и не является ли исходный пайплайн обработки .doc/сложно оформленных .docx источником более широкого класса подобных «немотивированных» ошибок retrieval в проде.</w:t>
+      </w:r>
+    </w:p>
+    <w:p>
+      <w:pPr>
+        <w:pStyle w:val="Heading2"/>
+      </w:pPr>
+      <w:r>
+        <w:t>Что нужно от разработчика (сводно)</w:t>
       </w:r>
     </w:p>
     <w:p>
@@ -330,7 +837,7 @@
         <w:pStyle w:val="ListNumber"/>
       </w:pPr>
       <w:r>
-        <w:t>Фильтр коллекции не передаётся или не применяется в запросе к векторному хранилищу (Qdrant) — UI показывает сужение, но фактический retrieval-запрос не содержит ограничения по collection_id/аналогичному полю.</w:t>
+        <w:t>Находка 1: подтвердить, что «поиск без ограничения при пустых чекбоксах коллекций» — ожидаемое поведение; рассмотреть более явную индикацию в UI чата.</w:t>
       </w:r>
     </w:p>
     <w:p>
@@ -338,7 +845,7 @@
         <w:pStyle w:val="ListNumber"/>
       </w:pPr>
       <w:r>
-        <w:t>Скрытый fallback на более широкий поиск, когда в выбранной коллекции результат слабый или отсутствует — если так, это должно быть видно пользователю в интерфейсе (например, пометкой «результат вне выбранной области»), а не молча подменяться.</w:t>
+        <w:t>Находка 2 (приоритет): разобраться, почему карточка источника систематически не совпадает с реальным источником ответа — начать с вопроса 2.3 («глоссарий», воспроизводится трижды на одном вопросе) и выяснить природу самого документа «глоссарий» (почему недоступен, откуда берётся).</w:t>
       </w:r>
     </w:p>
     <w:p>
@@ -346,47 +853,7 @@
         <w:pStyle w:val="ListNumber"/>
       </w:pPr>
       <w:r>
-        <w:t>Datafortest07.07.xlsx и user_guide_skeleton.md проиндексированы вне обычных доменных/коллекционных границ — возможно, как часть какого-то общесистемного/служебного индекса, который подмешивается в выдачу независимо от настроек области поиска.</w:t>
-      </w:r>
-    </w:p>
-    <w:p>
-      <w:pPr>
-        <w:pStyle w:val="Heading2"/>
-      </w:pPr>
-      <w:r>
-        <w:t>6. Влияние</w:t>
-      </w:r>
-    </w:p>
-    <w:p>
-      <w:pPr>
-        <w:pStyle w:val="ListBullet"/>
-      </w:pPr>
-      <w:r>
-        <w:t>Блокирует диагностический тест на изолированной коллекции ЭКО_2, задуманный именно для того, чтобы отделить эффект от переконвертации документов от прочих факторов (retrieval/ранжирование) — см. instrukciya-test-eko-2.md и pilot-test-03-eco2-protocol.md.</w:t>
-      </w:r>
-    </w:p>
-    <w:p>
-      <w:pPr>
-        <w:pStyle w:val="ListBullet"/>
-      </w:pPr>
-      <w:r>
-        <w:t>Ставит под сомнение любой сценарий, где заказчик рассчитывает на изоляцию данных по коллекциям при поиске — не только для тестирования, но потенциально и в проде (например, разграничение по доменам/подразделениям).</w:t>
-      </w:r>
-    </w:p>
-    <w:p>
-      <w:pPr>
-        <w:pStyle w:val="ListBullet"/>
-      </w:pPr>
-      <w:r>
-        <w:t>Затрудняет диагностику прошлых аномалий пилота — наблюдавшиеся 12.09 «случайные» источники (Datafortest07.07.xlsx, «глоссарий») теперь выглядят не случайностью ранжирования, а системным следствием этого же бага.</w:t>
-      </w:r>
-    </w:p>
-    <w:p>
-      <w:pPr>
-        <w:pStyle w:val="Heading2"/>
-      </w:pPr>
-      <w:r>
-        <w:t>7. Что нужно от разработчика</w:t>
+        <w:t>Находка 3: сверить пайплайн обработки исходных файлов «для теста ИИ (1)» (07.07.2026) с нашим пайплайном переконвертации — понять, что конкретно изменилось и почему это чинит retrieval для этих трёх документов.</w:t>
       </w:r>
     </w:p>
     <w:p>
@@ -394,31 +861,7 @@
         <w:pStyle w:val="ListNumber"/>
       </w:pPr>
       <w:r>
-        <w:t>Подтвердить или опровергнуть, что фильтр «Область поиска» → коллекция реально ограничивает retrieval-запрос.</w:t>
-      </w:r>
-    </w:p>
-    <w:p>
-      <w:pPr>
-        <w:pStyle w:val="ListNumber"/>
-      </w:pPr>
-      <w:r>
-        <w:t>Если фильтр работает штатно — объяснить, почему коллекция ЭКО_2 (27/27 документов, «Готово», 0 ошибок) не участвует в выдаче ни в одном из трёх наблюдений выше.</w:t>
-      </w:r>
-    </w:p>
-    <w:p>
-      <w:pPr>
-        <w:pStyle w:val="ListNumber"/>
-      </w:pPr>
-      <w:r>
-        <w:t>Прояснить происхождение и область индексации Datafortest07.07.xlsx и user_guide_skeleton.md — почему они всплывают по темам СМК-регламентов «Эко», не имеющим отношения к их вероятному содержимому.</w:t>
-      </w:r>
-    </w:p>
-    <w:p>
-      <w:pPr>
-        <w:pStyle w:val="ListNumber"/>
-      </w:pPr>
-      <w:r>
-        <w:t>После исправления — дать знать, чтобы повторить тест на ЭКО_2 (шаблон протокола и вопросы уже готовы, см. pilot-test-03-eco2-protocol.md, pilot-test-03-eco2-prioritet.md).</w:t>
+        <w:t>После ответа по находкам 1–2 — сообщить нам, чтобы продолжить полный цикл теста (осталась перепроверка прохода B — SQL/каталог выключен, — не проводившаяся сегодня).</w:t>
       </w:r>
     </w:p>
     <w:sectPr>

</xml_diff>

<commit_message>
Tighten bug report prose (concision pass)
Agent-reviewed pass: trimmed redundant hedging and restated phrasing
in the Находка 1-3 prose sections. No facts, timestamps, percentages,
document codes, quotes, or table data were changed -- only wording.
Rebuilt the .docx from the trimmed .md.

Co-Authored-By: Claude Sonnet 5 <noreply@anthropic.com>
Claude-Session: https://claude.ai/code/session_01DpSN8JwCJ3tg3JVUadr2zE
</commit_message>
<xml_diff>
--- a/docs/accounts/eco/bug-report-oblast-poiska-scope.docx
+++ b/docs/accounts/eco/bug-report-oblast-poiska-scope.docx
@@ -12,22 +12,86 @@
     </w:p>
     <w:p>
       <w:r>
-        <w:t>Кому: команда разработки платформы (Камерата)</w:t>
+        <w:rPr>
+          <w:b/>
+        </w:rPr>
+        <w:t>Кому:</w:t>
+      </w:r>
+      <w:r>
+        <w:t xml:space="preserve"> команда разработки платформы (Камерата)</w:t>
       </w:r>
     </w:p>
     <w:p>
       <w:r>
-        <w:t>От: АО «Эко Ресурс», пилотный проект СМК</w:t>
+        <w:rPr>
+          <w:b/>
+        </w:rPr>
+        <w:t>От:</w:t>
+      </w:r>
+      <w:r>
+        <w:t xml:space="preserve"> АО «Эко Ресурс», пилотный проект СМК</w:t>
       </w:r>
     </w:p>
     <w:p>
       <w:r>
-        <w:t>Дата: 12.09.2026</w:t>
+        <w:rPr>
+          <w:b/>
+        </w:rPr>
+        <w:t>Дата:</w:t>
+      </w:r>
+      <w:r>
+        <w:t xml:space="preserve"> 12.09.2026</w:t>
       </w:r>
     </w:p>
     <w:p>
       <w:r>
-        <w:t>Статус: три отдельные находки по итогам полного дня тестирования (18 вопросов пилота, коллекции eco/ЭКО_2, агенты «Аналитик» и «Closed-book RAG»). Полный протокол со всеми скриншотами и построчными результатами — pilot-test-03-eco2-protocol.md/.docx.</w:t>
+        <w:rPr>
+          <w:b/>
+        </w:rPr>
+        <w:t>Статус:</w:t>
+      </w:r>
+      <w:r>
+        <w:t xml:space="preserve"> три отдельные находки по итогам полного дня тестирования (18 вопросов пилота, коллекции </w:t>
+      </w:r>
+      <w:r>
+        <w:rPr>
+          <w:rFonts w:ascii="Consolas" w:hAnsi="Consolas"/>
+          <w:sz w:val="20"/>
+        </w:rPr>
+        <w:t>eco</w:t>
+      </w:r>
+      <w:r>
+        <w:t>/</w:t>
+      </w:r>
+      <w:r>
+        <w:rPr>
+          <w:rFonts w:ascii="Consolas" w:hAnsi="Consolas"/>
+          <w:sz w:val="20"/>
+        </w:rPr>
+        <w:t>ЭКО_2</w:t>
+      </w:r>
+      <w:r>
+        <w:t xml:space="preserve">, агенты «Аналитик» и «Closed-book RAG»). Полный протокол со всеми скриншотами и построчными результатами — </w:t>
+      </w:r>
+      <w:r>
+        <w:rPr>
+          <w:rFonts w:ascii="Consolas" w:hAnsi="Consolas"/>
+          <w:sz w:val="20"/>
+        </w:rPr>
+        <w:t>pilot-test-03-eco2-protocol.md</w:t>
+      </w:r>
+      <w:r>
+        <w:t>/</w:t>
+      </w:r>
+      <w:r>
+        <w:rPr>
+          <w:rFonts w:ascii="Consolas" w:hAnsi="Consolas"/>
+          <w:sz w:val="20"/>
+        </w:rPr>
+        <w:t>.docx</w:t>
+      </w:r>
+      <w:r>
+        <w:t>.</w:t>
       </w:r>
     </w:p>
     <w:p>
@@ -173,7 +237,13 @@
           </w:tcPr>
           <w:p>
             <w:r>
-              <w:t>Подтверждённый баг, воспроизводится системно</w:t>
+              <w:rPr>
+                <w:b/>
+              </w:rPr>
+              <w:t>Подтверждённый баг</w:t>
+            </w:r>
+            <w:r>
+              <w:t>, воспроизводится системно</w:t>
             </w:r>
           </w:p>
         </w:tc>
@@ -232,6 +302,11 @@
       </w:tr>
     </w:tbl>
     <w:p>
+      <w:r>
+        <w:t>---</w:t>
+      </w:r>
+    </w:p>
+    <w:p>
       <w:pPr>
         <w:pStyle w:val="Heading2"/>
       </w:pPr>
@@ -249,7 +324,57 @@
     </w:p>
     <w:p>
       <w:r>
-        <w:t>Один и тот же вопрос («Какие поля заполняет оператор после фасовки продукции?») задан с областью поиска, попеременно сужаемой до ЭКО_2 и до ЭКО — результат и источник были идентичны в обоих случаях (для теста ИИ (1)/И-15-06-08...docx, 86%→88%). Позже, в 15:35, вопрос с ответом, гарантированно уникальным для ЭКО_2 (документ загружен в этот же день), дал «не найдено» с тремя посторонними источниками, ни один — не из ЭКО_2.</w:t>
+        <w:t xml:space="preserve">Один и тот же вопрос («Какие поля заполняет оператор после фасовки продукции?») задан с областью поиска, попеременно сужаемой до </w:t>
+      </w:r>
+      <w:r>
+        <w:rPr>
+          <w:rFonts w:ascii="Consolas" w:hAnsi="Consolas"/>
+          <w:sz w:val="20"/>
+        </w:rPr>
+        <w:t>ЭКО_2</w:t>
+      </w:r>
+      <w:r>
+        <w:t xml:space="preserve"> и до </w:t>
+      </w:r>
+      <w:r>
+        <w:rPr>
+          <w:rFonts w:ascii="Consolas" w:hAnsi="Consolas"/>
+          <w:sz w:val="20"/>
+        </w:rPr>
+        <w:t>ЭКО</w:t>
+      </w:r>
+      <w:r>
+        <w:t xml:space="preserve"> — результат и источник были идентичны в обоих случаях (</w:t>
+      </w:r>
+      <w:r>
+        <w:rPr>
+          <w:rFonts w:ascii="Consolas" w:hAnsi="Consolas"/>
+          <w:sz w:val="20"/>
+        </w:rPr>
+        <w:t>для теста ИИ (1)/И-15-06-08...docx</w:t>
+      </w:r>
+      <w:r>
+        <w:t xml:space="preserve">, 86%→88%). Позже, в 15:35, вопрос с ответом, гарантированно уникальным для </w:t>
+      </w:r>
+      <w:r>
+        <w:rPr>
+          <w:rFonts w:ascii="Consolas" w:hAnsi="Consolas"/>
+          <w:sz w:val="20"/>
+        </w:rPr>
+        <w:t>ЭКО_2</w:t>
+      </w:r>
+      <w:r>
+        <w:t xml:space="preserve"> (документ загружен в этот же день), дал «не найдено» с тремя посторонними источниками, ни один — не из </w:t>
+      </w:r>
+      <w:r>
+        <w:rPr>
+          <w:rFonts w:ascii="Consolas" w:hAnsi="Consolas"/>
+          <w:sz w:val="20"/>
+        </w:rPr>
+        <w:t>ЭКО_2</w:t>
+      </w:r>
+      <w:r>
+        <w:t>.</w:t>
       </w:r>
     </w:p>
     <w:p>
@@ -262,7 +387,25 @@
     </w:p>
     <w:p>
       <w:r>
-        <w:t>Скриншот попапа «Где искать» показал: в блоке «КОЛЛЕКЦИИ» ни ЭКО_2, ни ЭКО не были отмечены чекбоксом, а подпись внизу гласит: «Данные и документы — все разрешённые источники». То есть при пустых чекбоксах коллекций поиск идёт по всем источникам без ограничения — вероятно, именно это и произошло в наблюдениях 15:06–15:35 (хотя для того момента отдельного скриншота настроек не сохранилось, это ретроспективная, а не подтверждённая на месте гипотеза).</w:t>
+        <w:t xml:space="preserve">Скриншот попапа «Где искать» показал: в блоке «КОЛЛЕКЦИИ» </w:t>
+      </w:r>
+      <w:r>
+        <w:rPr>
+          <w:b/>
+        </w:rPr>
+        <w:t>ни `ЭКО_2`, ни `ЭКО` не были отмечены чекбоксом</w:t>
+      </w:r>
+      <w:r>
+        <w:t xml:space="preserve">, а подпись внизу гласит: </w:t>
+      </w:r>
+      <w:r>
+        <w:rPr>
+          <w:b/>
+        </w:rPr>
+        <w:t>«Данные и документы — все разрешённые источники»</w:t>
+      </w:r>
+      <w:r>
+        <w:t>. То есть при пустых чекбоксах поиск идёт по всем источникам без ограничения — вероятно, это и произошло в 15:06–15:35 (скриншот настроек на тот момент не сохранился — гипотеза ретроспективная).</w:t>
       </w:r>
     </w:p>
     <w:p>
@@ -275,7 +418,67 @@
     </w:p>
     <w:p>
       <w:r>
-        <w:t>Позже в тот же день, с явно подтверждённым скриншотом «Где искать» (только «Документы», коллекция ЭКО отмечена, ЭКО_2 — нет), результаты стабильно и правильно ограничивались коллекцией ЭКО на протяжении всех 18 вопросов пилота (см. pilot-test-03-eco2-protocol.md, §1b). При целевых перепроверках с явным переключением на ЭКО_2 источники менялись на файлы из ЭКО_2 корректно (см. там же, §1c: вопросы 2.2, 3.2, 5.2, 6.2).</w:t>
+        <w:t xml:space="preserve">Позже в тот же день, с явно подтверждённым скриншотом «Где искать» (только «Документы», коллекция </w:t>
+      </w:r>
+      <w:r>
+        <w:rPr>
+          <w:rFonts w:ascii="Consolas" w:hAnsi="Consolas"/>
+          <w:sz w:val="20"/>
+        </w:rPr>
+        <w:t>ЭКО</w:t>
+      </w:r>
+      <w:r>
+        <w:t xml:space="preserve"> отмечена, </w:t>
+      </w:r>
+      <w:r>
+        <w:rPr>
+          <w:rFonts w:ascii="Consolas" w:hAnsi="Consolas"/>
+          <w:sz w:val="20"/>
+        </w:rPr>
+        <w:t>ЭКО_2</w:t>
+      </w:r>
+      <w:r>
+        <w:t xml:space="preserve"> — нет), результаты стабильно и правильно ограничивались коллекцией </w:t>
+      </w:r>
+      <w:r>
+        <w:rPr>
+          <w:rFonts w:ascii="Consolas" w:hAnsi="Consolas"/>
+          <w:sz w:val="20"/>
+        </w:rPr>
+        <w:t>ЭКО</w:t>
+      </w:r>
+      <w:r>
+        <w:t xml:space="preserve"> на протяжении всех 18 вопросов пилота (см. </w:t>
+      </w:r>
+      <w:r>
+        <w:rPr>
+          <w:rFonts w:ascii="Consolas" w:hAnsi="Consolas"/>
+          <w:sz w:val="20"/>
+        </w:rPr>
+        <w:t>pilot-test-03-eco2-protocol.md</w:t>
+      </w:r>
+      <w:r>
+        <w:t xml:space="preserve">, §1b). При целевых перепроверках с явным переключением на </w:t>
+      </w:r>
+      <w:r>
+        <w:rPr>
+          <w:rFonts w:ascii="Consolas" w:hAnsi="Consolas"/>
+          <w:sz w:val="20"/>
+        </w:rPr>
+        <w:t>ЭКО_2</w:t>
+      </w:r>
+      <w:r>
+        <w:t xml:space="preserve"> источники менялись на файлы из </w:t>
+      </w:r>
+      <w:r>
+        <w:rPr>
+          <w:rFonts w:ascii="Consolas" w:hAnsi="Consolas"/>
+          <w:sz w:val="20"/>
+        </w:rPr>
+        <w:t>ЭКО_2</w:t>
+      </w:r>
+      <w:r>
+        <w:t xml:space="preserve"> корректно (см. там же, §1c: вопросы 2.2, 3.2, 5.2, 6.2).</w:t>
       </w:r>
     </w:p>
     <w:p>
@@ -288,7 +491,16 @@
     </w:p>
     <w:p>
       <w:r>
-        <w:t>Похоже, это не баг retrieval-фильтрации как таковой, а особенность интерфейса: незаполненные чекбоксы коллекций трактуются как «искать везде», без явного индикатора этого состояния в чате (только мелкая подпись в попапе настроек, легко упустить). Это создаёт риск: пользователь предполагает, что область сужена, хотя чекбоксы не отмечены, и получает нерепрезентативный результат, не понимая почему.</w:t>
+        <w:t xml:space="preserve">Похоже, это не баг retrieval-фильтрации, а </w:t>
+      </w:r>
+      <w:r>
+        <w:rPr>
+          <w:b/>
+        </w:rPr>
+        <w:t>особенность интерфейса</w:t>
+      </w:r>
+      <w:r>
+        <w:t>. Риск: пользователь предполагает, что область поиска сужена, хотя чекбоксы не отмечены, и получает нерепрезентативный результат, не понимая почему; единственный индикатор состояния — мелкая подпись в попапе настроек, легко упустить.</w:t>
       </w:r>
     </w:p>
     <w:p>
@@ -296,10 +508,15 @@
         <w:rPr>
           <w:b/>
         </w:rPr>
-        <w:t xml:space="preserve">Вопрос к разработчику: </w:t>
+        <w:t>Вопрос к разработчику:</w:t>
       </w:r>
       <w:r>
-        <w:t>подтвердить, что это ожидаемое поведение (не баг), и рассмотреть более явную индикацию в самом чате (не только в попапе), когда поиск не ограничен ни одной коллекцией — например, бейдж «Поиск без ограничения по коллекциям» рядом с полем ввода.</w:t>
+        <w:t xml:space="preserve"> подтвердить, что это ожидаемое поведение (не баг), и рассмотреть более явную индикацию в самом чате (не только в попапе), когда поиск не ограничен ни одной коллекцией — например, бейдж «Поиск без ограничения по коллекциям» рядом с полем ввода.</w:t>
+      </w:r>
+    </w:p>
+    <w:p>
+      <w:r>
+        <w:t>---</w:t>
       </w:r>
     </w:p>
     <w:p>
@@ -315,10 +532,28 @@
         <w:rPr>
           <w:b/>
         </w:rPr>
-        <w:t xml:space="preserve">Это главная, надёжно подтверждённая находка дня. </w:t>
+        <w:t>Это главная, надёжно подтверждённая находка дня.</w:t>
       </w:r>
       <w:r>
-        <w:t>За один прогон 18 вопросов (12.09, 18:27–19:34) карточка источника не совпадала с документом, реально процитированным в тексте ответа, минимум 8 раз — независимо от того, был ли сам текстовый ответ верным, и независимо от агента/коллекции:</w:t>
+        <w:t xml:space="preserve"> За один прогон 18 вопросов (12.09, 18:27–19:34) карточка источника </w:t>
+      </w:r>
+      <w:r>
+        <w:rPr>
+          <w:b/>
+        </w:rPr>
+        <w:t>не совпадала</w:t>
+      </w:r>
+      <w:r>
+        <w:t xml:space="preserve"> с документом, реально процитированным в тексте ответа, минимум </w:t>
+      </w:r>
+      <w:r>
+        <w:rPr>
+          <w:b/>
+        </w:rPr>
+        <w:t>8 раз</w:t>
+      </w:r>
+      <w:r>
+        <w:t xml:space="preserve"> — независимо от того, был ли сам текстовый ответ верным, и независимо от агента/коллекции:</w:t>
       </w:r>
     </w:p>
     <w:tbl>
@@ -394,7 +629,17 @@
           </w:tcPr>
           <w:p>
             <w:r>
-              <w:t>1.3 (на ЭКО_2)</w:t>
+              <w:t xml:space="preserve">1.3 (на </w:t>
+            </w:r>
+            <w:r>
+              <w:rPr>
+                <w:rFonts w:ascii="Consolas" w:hAnsi="Consolas"/>
+                <w:sz w:val="20"/>
+              </w:rPr>
+              <w:t>ЭКО_2</w:t>
+            </w:r>
+            <w:r>
+              <w:t>)</w:t>
             </w:r>
           </w:p>
         </w:tc>
@@ -414,7 +659,17 @@
           </w:tcPr>
           <w:p>
             <w:r>
-              <w:t>И-16-01-11 (наш файл ЭКО_2)</w:t>
+              <w:t xml:space="preserve">И-16-01-11 (наш файл </w:t>
+            </w:r>
+            <w:r>
+              <w:rPr>
+                <w:rFonts w:ascii="Consolas" w:hAnsi="Consolas"/>
+                <w:sz w:val="20"/>
+              </w:rPr>
+              <w:t>ЭКО_2</w:t>
+            </w:r>
+            <w:r>
+              <w:t>)</w:t>
             </w:r>
           </w:p>
         </w:tc>
@@ -424,6 +679,9 @@
           </w:tcPr>
           <w:p>
             <w:r>
+              <w:rPr>
+                <w:b/>
+              </w:rPr>
               <w:t>«глоссарий», 100%</w:t>
             </w:r>
           </w:p>
@@ -508,6 +766,9 @@
           </w:tcPr>
           <w:p>
             <w:r>
+              <w:rPr>
+                <w:b/>
+              </w:rPr>
               <w:t>«глоссарий», 100%</w:t>
             </w:r>
           </w:p>
@@ -550,7 +811,13 @@
           </w:tcPr>
           <w:p>
             <w:r>
-              <w:t>«глоссарий», 100% — опять</w:t>
+              <w:rPr>
+                <w:b/>
+              </w:rPr>
+              <w:t>«глоссарий», 100%</w:t>
+            </w:r>
+            <w:r>
+              <w:t xml:space="preserve"> — опять</w:t>
             </w:r>
           </w:p>
         </w:tc>
@@ -592,7 +859,16 @@
           </w:tcPr>
           <w:p>
             <w:r>
-              <w:t>Д-11-06-01 и ПР-03-00-12 (оба неверные)</w:t>
+              <w:t xml:space="preserve">Д-11-06-01 </w:t>
+            </w:r>
+            <w:r>
+              <w:rPr>
+                <w:b/>
+              </w:rPr>
+              <w:t>и</w:t>
+            </w:r>
+            <w:r>
+              <w:t xml:space="preserve"> ПР-03-00-12 (оба неверные, двойное несовпадение)</w:t>
             </w:r>
           </w:p>
         </w:tc>
@@ -624,7 +900,7 @@
           </w:tcPr>
           <w:p>
             <w:r>
-              <w:t>ПР-09-00-14 + ПР-03-00-12</w:t>
+              <w:t>ПР-09-00-14 + ПР-03-00-12 (два источника)</w:t>
             </w:r>
           </w:p>
         </w:tc>
@@ -634,7 +910,7 @@
           </w:tcPr>
           <w:p>
             <w:r>
-              <w:t>только ПР-03-00-12 (второй не показан)</w:t>
+              <w:t>только ПР-03-00-12 (второй не показан вообще)</w:t>
             </w:r>
           </w:p>
         </w:tc>
@@ -646,7 +922,17 @@
           </w:tcPr>
           <w:p>
             <w:r>
-              <w:t>5.2 (фикс на ЭКО_2)</w:t>
+              <w:t xml:space="preserve">5.2 (фикс на </w:t>
+            </w:r>
+            <w:r>
+              <w:rPr>
+                <w:rFonts w:ascii="Consolas" w:hAnsi="Consolas"/>
+                <w:sz w:val="20"/>
+              </w:rPr>
+              <w:t>ЭКО_2</w:t>
+            </w:r>
+            <w:r>
+              <w:t>)</w:t>
             </w:r>
           </w:p>
         </w:tc>
@@ -666,7 +952,17 @@
           </w:tcPr>
           <w:p>
             <w:r>
-              <w:t>ПР-10(02)-00 (наш файл ЭКО_2)</w:t>
+              <w:t xml:space="preserve">ПР-10(02)-00 (наш файл </w:t>
+            </w:r>
+            <w:r>
+              <w:rPr>
+                <w:rFonts w:ascii="Consolas" w:hAnsi="Consolas"/>
+                <w:sz w:val="20"/>
+              </w:rPr>
+              <w:t>ЭКО_2</w:t>
+            </w:r>
+            <w:r>
+              <w:t>)</w:t>
             </w:r>
           </w:p>
         </w:tc>
@@ -718,6 +1014,9 @@
           </w:tcPr>
           <w:p>
             <w:r>
+              <w:rPr>
+                <w:b/>
+              </w:rPr>
               <w:t>блок карточек полностью пуст</w:t>
             </w:r>
           </w:p>
@@ -734,7 +1033,16 @@
     </w:p>
     <w:p>
       <w:r>
-        <w:t>Этот конкретный вопрос дважды сегодня и один раз 12.09 (в предыдущем ре-тесте) показал карточку «глоссарий», 100% — три раза подряд на одном и том же вопросе, с разными агентами/днями/текстами ответа. Это самый надёжно воспроизводимый случай аномалии, вероятно, удобная отправная точка для разработчика.</w:t>
+        <w:t xml:space="preserve">Этот конкретный вопрос </w:t>
+      </w:r>
+      <w:r>
+        <w:rPr>
+          <w:b/>
+        </w:rPr>
+        <w:t>дважды сегодня и один раз 12.09</w:t>
+      </w:r>
+      <w:r>
+        <w:t xml:space="preserve"> (в предыдущем ре-тесте) показал карточку «глоссарий», 100% — три раза подряд на одном и том же вопросе, с разными агентами/днями/текстами ответа. Это самый надёжно воспроизводимый случай аномалии, вероятно, удобная отправная точка для разработчика.</w:t>
       </w:r>
     </w:p>
     <w:p>
@@ -747,12 +1055,59 @@
     </w:p>
     <w:p>
       <w:r>
-        <w:t>В интерфейсе несколько раз всплывало системное сообщение: «Документ «глоссарий» недоступен» — при попытке открыть карточку. Если сам документ «глоссарий» повреждён, отсутствует или является каким-то пустым/служебным плейсхолдером, это может объяснять аномалию: битый или вырожденный embedding такого документа способен патологически «притягивать» высокий скор совпадения (100%) независимо от содержания запроса.</w:t>
+        <w:t xml:space="preserve">В интерфейсе несколько раз всплывало системное сообщение: </w:t>
+      </w:r>
+      <w:r>
+        <w:rPr>
+          <w:b/>
+        </w:rPr>
+        <w:t>«Документ «глоссарий» недоступен»</w:t>
+      </w:r>
+      <w:r>
+        <w:t xml:space="preserve"> — при попытке открыть карточку. Если документ «глоссарий» повреждён, отсутствует или является пустым/служебным плейсхолдером, это может объяснять аномалию: битый или вырожденный embedding способен «притягивать» высокий скор совпадения (100%) независимо от содержания запроса.</w:t>
       </w:r>
     </w:p>
     <w:p>
       <w:r>
-        <w:t>Отдельно подтверждено (по полному списку документов коллекции eco, см. Приложение в pilot-test-03-eco2-protocol.md): файла с названием «глоссарий» среди 27 документов «для теста ИИ (1)» нет вообще — источник этой аномалии физически находится за пределами проверяемой коллекции/папки.</w:t>
+        <w:t xml:space="preserve">Отдельно подтверждено (по полному списку документов коллекции </w:t>
+      </w:r>
+      <w:r>
+        <w:rPr>
+          <w:rFonts w:ascii="Consolas" w:hAnsi="Consolas"/>
+          <w:sz w:val="20"/>
+        </w:rPr>
+        <w:t>eco</w:t>
+      </w:r>
+      <w:r>
+        <w:t xml:space="preserve">, см. Приложение в </w:t>
+      </w:r>
+      <w:r>
+        <w:rPr>
+          <w:rFonts w:ascii="Consolas" w:hAnsi="Consolas"/>
+          <w:sz w:val="20"/>
+        </w:rPr>
+        <w:t>pilot-test-03-eco2-protocol.md</w:t>
+      </w:r>
+      <w:r>
+        <w:t xml:space="preserve">): </w:t>
+      </w:r>
+      <w:r>
+        <w:rPr>
+          <w:b/>
+        </w:rPr>
+        <w:t>файла с названием «глоссарий» среди 27 документов «для теста ИИ (1)» нет вообще</w:t>
+      </w:r>
+      <w:r>
+        <w:t xml:space="preserve"> — источник этой аномалии физически находится </w:t>
+      </w:r>
+      <w:r>
+        <w:rPr>
+          <w:b/>
+        </w:rPr>
+        <w:t>за пределами</w:t>
+      </w:r>
+      <w:r>
+        <w:t xml:space="preserve"> проверяемой коллекции/папки.</w:t>
       </w:r>
     </w:p>
     <w:p>
@@ -760,12 +1115,12 @@
         <w:pStyle w:val="Heading3"/>
       </w:pPr>
       <w:r>
-        <w:t xml:space="preserve">Вывод </w:t>
+        <w:t>Вывод</w:t>
       </w:r>
     </w:p>
     <w:p>
       <w:r>
-        <w:t>Карточка источника — ненадёжный индикатор происхождения ответа. Пользователь, доверяющий карточке буквально (не сверяя её с цитатами в самом тексте), может сделать неверные выводы о том, откуда на самом деле взялся ответ — риск для доверия к системе цитирования в целом.</w:t>
+        <w:t>Карточка источника — ненадёжный индикатор происхождения ответа: пользователь, доверяющий ей без сверки с текстом, может сделать неверные выводы об источнике ответа — риск для доверия к системе цитирования.</w:t>
       </w:r>
     </w:p>
     <w:p>
@@ -773,10 +1128,15 @@
         <w:rPr>
           <w:b/>
         </w:rPr>
-        <w:t xml:space="preserve">Вопрос к разработчику: </w:t>
+        <w:t>Вопрос к разработчику:</w:t>
       </w:r>
       <w:r>
-        <w:t>это баг рендеринга карточки (берёт не тот chunk/документ при формировании UI) или реальная ошибка retrieval (в контекст модели действительно попадает другой документ, просто текст модель формулирует по своим знаниям)? Разница критична для диагностики и доверия к самим текстовым ответам, не только к карточкам.</w:t>
+        <w:t xml:space="preserve"> это баг рендеринга карточки (берёт не тот chunk/документ при формировании UI) или реальная ошибка retrieval (в контекст модели действительно попадает другой документ, просто текст модель формулирует по своим знаниям)? Разница критична для диагностики и доверия к самим текстовым ответам, не только к карточкам.</w:t>
+      </w:r>
+    </w:p>
+    <w:p>
+      <w:r>
+        <w:t>---</w:t>
       </w:r>
     </w:p>
     <w:p>
@@ -794,12 +1154,157 @@
     </w:p>
     <w:p>
       <w:r>
-        <w:t>Три вопроса пилота (5.2 — приоритет заявок на ремонт, 6.2 — добавление Спецификации в 1С-8, 2.2 — корректировка Заказа на производство) систематически проваливались на исходной коллекции eco во всех трёх раундах тестирования (11.09, 12.09, и снова сегодня) — при том что нужные документы физически присутствовали в корпусе eco/для теста ИИ (1). До сегодняшнего дня 5.2 считался «контрольным случаем чистой retrieval-ошибки, не связанной с форматом», потому что исходный файл был читаемым .docx.</w:t>
+        <w:t>Три вопроса пилота (</w:t>
+      </w:r>
+      <w:r>
+        <w:rPr>
+          <w:b/>
+        </w:rPr>
+        <w:t>5.2</w:t>
+      </w:r>
+      <w:r>
+        <w:t xml:space="preserve"> — приоритет заявок на ремонт, </w:t>
+      </w:r>
+      <w:r>
+        <w:rPr>
+          <w:b/>
+        </w:rPr>
+        <w:t>6.2</w:t>
+      </w:r>
+      <w:r>
+        <w:t xml:space="preserve"> — добавление Спецификации в 1С-8, </w:t>
+      </w:r>
+      <w:r>
+        <w:rPr>
+          <w:b/>
+        </w:rPr>
+        <w:t>2.2</w:t>
+      </w:r>
+      <w:r>
+        <w:t xml:space="preserve"> — корректировка Заказа на производство) систематически проваливались на исходной коллекции </w:t>
+      </w:r>
+      <w:r>
+        <w:rPr>
+          <w:rFonts w:ascii="Consolas" w:hAnsi="Consolas"/>
+          <w:sz w:val="20"/>
+        </w:rPr>
+        <w:t>eco</w:t>
+      </w:r>
+      <w:r>
+        <w:t xml:space="preserve"> во всех трёх раундах тестирования (11.09, 12.09, и снова сегодня) — при том что нужные документы физически присутствовали в корпусе </w:t>
+      </w:r>
+      <w:r>
+        <w:rPr>
+          <w:rFonts w:ascii="Consolas" w:hAnsi="Consolas"/>
+          <w:sz w:val="20"/>
+        </w:rPr>
+        <w:t>eco</w:t>
+      </w:r>
+      <w:r>
+        <w:t>/</w:t>
+      </w:r>
+      <w:r>
+        <w:rPr>
+          <w:rFonts w:ascii="Consolas" w:hAnsi="Consolas"/>
+          <w:sz w:val="20"/>
+        </w:rPr>
+        <w:t>для теста ИИ (1)</w:t>
+      </w:r>
+      <w:r>
+        <w:t xml:space="preserve">. До сегодняшнего дня 5.2 считался «контрольным случаем чистой retrieval-ошибки, не связанной с форматом», потому что исходный файл был читаемым </w:t>
+      </w:r>
+      <w:r>
+        <w:rPr>
+          <w:rFonts w:ascii="Consolas" w:hAnsi="Consolas"/>
+          <w:sz w:val="20"/>
+        </w:rPr>
+        <w:t>.docx</w:t>
+      </w:r>
+      <w:r>
+        <w:t>.</w:t>
       </w:r>
     </w:p>
     <w:p>
       <w:r>
-        <w:t>Сегодня те же три вопроса были заданы на коллекции ЭКО_2, куда мы загрузили те же документы, но пересобранные заново через собственный пайплайн (catdoc для .doc + python-docx, переразбивка на абзацы, единый новый файл — см. README.md, раздел «converted-for-upload»). Все три вопроса дали полные, верные ответы с точными ссылками на нужные документы (eco-converted-for-upload/...), без единого исключения (n=3 из 3).</w:t>
+        <w:t xml:space="preserve">Сегодня те же три вопроса были заданы на коллекции </w:t>
+      </w:r>
+      <w:r>
+        <w:rPr>
+          <w:rFonts w:ascii="Consolas" w:hAnsi="Consolas"/>
+          <w:sz w:val="20"/>
+        </w:rPr>
+        <w:t>ЭКО_2</w:t>
+      </w:r>
+      <w:r>
+        <w:t xml:space="preserve">, куда мы загрузили </w:t>
+      </w:r>
+      <w:r>
+        <w:rPr>
+          <w:b/>
+        </w:rPr>
+        <w:t>те же документы</w:t>
+      </w:r>
+      <w:r>
+        <w:t>, но пересобранные заново через собственный пайплайн (</w:t>
+      </w:r>
+      <w:r>
+        <w:rPr>
+          <w:rFonts w:ascii="Consolas" w:hAnsi="Consolas"/>
+          <w:sz w:val="20"/>
+        </w:rPr>
+        <w:t>catdoc</w:t>
+      </w:r>
+      <w:r>
+        <w:t xml:space="preserve"> для </w:t>
+      </w:r>
+      <w:r>
+        <w:rPr>
+          <w:rFonts w:ascii="Consolas" w:hAnsi="Consolas"/>
+          <w:sz w:val="20"/>
+        </w:rPr>
+        <w:t>.doc</w:t>
+      </w:r>
+      <w:r>
+        <w:t xml:space="preserve"> + </w:t>
+      </w:r>
+      <w:r>
+        <w:rPr>
+          <w:rFonts w:ascii="Consolas" w:hAnsi="Consolas"/>
+          <w:sz w:val="20"/>
+        </w:rPr>
+        <w:t>python-docx</w:t>
+      </w:r>
+      <w:r>
+        <w:t xml:space="preserve">, переразбивка на абзацы, единый новый файл — см. </w:t>
+      </w:r>
+      <w:r>
+        <w:rPr>
+          <w:rFonts w:ascii="Consolas" w:hAnsi="Consolas"/>
+          <w:sz w:val="20"/>
+        </w:rPr>
+        <w:t>README.md</w:t>
+      </w:r>
+      <w:r>
+        <w:t xml:space="preserve">, раздел «converted-for-upload»). </w:t>
+      </w:r>
+      <w:r>
+        <w:rPr>
+          <w:b/>
+        </w:rPr>
+        <w:t>Все три вопроса дали полные, верные ответы</w:t>
+      </w:r>
+      <w:r>
+        <w:t xml:space="preserve"> с точными ссылками на нужные документы (</w:t>
+      </w:r>
+      <w:r>
+        <w:rPr>
+          <w:rFonts w:ascii="Consolas" w:hAnsi="Consolas"/>
+          <w:sz w:val="20"/>
+        </w:rPr>
+        <w:t>eco-converted-for-upload/...</w:t>
+      </w:r>
+      <w:r>
+        <w:t>), без единого исключения (n=3 из 3).</w:t>
       </w:r>
     </w:p>
     <w:p>
@@ -807,10 +1312,29 @@
         <w:rPr>
           <w:b/>
         </w:rPr>
-        <w:t xml:space="preserve">Рабочая гипотеза: </w:t>
+        <w:t>Рабочая гипотеза:</w:t>
       </w:r>
       <w:r>
-        <w:t>проблема была не в «неразрешимой» ошибке retrieval как таковой, а в качестве чанкования/эмбеддинга конкретных файлов при их первой обработке (загрузка irina, 07.07.2026, пайплайн обработки на тот момент неизвестен) — возможно, из-за особенностей исходного форматирования (таблицы, стили), которые платформа некорректно разбила на чанки. Переконвертация этих же документов через более простой, «плоский» пайплайн, похоже, случайно дала более качественное чанкование.</w:t>
+        <w:t xml:space="preserve"> проблема была не в «неразрешимой» ошибке retrieval, а в </w:t>
+      </w:r>
+      <w:r>
+        <w:rPr>
+          <w:b/>
+        </w:rPr>
+        <w:t>качестве чанкования/эмбеддинга при первой обработке файлов</w:t>
+      </w:r>
+      <w:r>
+        <w:t xml:space="preserve"> (загрузка </w:t>
+      </w:r>
+      <w:r>
+        <w:rPr>
+          <w:rFonts w:ascii="Consolas" w:hAnsi="Consolas"/>
+          <w:sz w:val="20"/>
+        </w:rPr>
+        <w:t>irina</w:t>
+      </w:r>
+      <w:r>
+        <w:t>, 07.07.2026, пайплайн обработки на тот момент неизвестен) — возможно, из-за особенностей исходного форматирования (таблицы, стили), которые платформа некорректно разбила на чанки. Переконвертация через более простой, «плоский» пайплайн случайно дала более качественное чанкование.</w:t>
       </w:r>
     </w:p>
     <w:p>
@@ -818,10 +1342,35 @@
         <w:rPr>
           <w:b/>
         </w:rPr>
-        <w:t xml:space="preserve">Вопрос к разработчику: </w:t>
+        <w:t>Вопрос к разработчику:</w:t>
       </w:r>
       <w:r>
-        <w:t>если гипотеза верна — стоит проверить, чем отличается обработка исходных версий этих трёх файлов от переконвертированных (chunk-границы, эмбеддинги), и не является ли исходный пайплайн обработки .doc/сложно оформленных .docx источником более широкого класса подобных «немотивированных» ошибок retrieval в проде.</w:t>
+        <w:t xml:space="preserve"> если гипотеза верна — стоит проверить, чем отличается обработка исходных версий этих трёх файлов от переконвертированных (chunk-границы, эмбеддинги), и не является ли исходный пайплайн обработки </w:t>
+      </w:r>
+      <w:r>
+        <w:rPr>
+          <w:rFonts w:ascii="Consolas" w:hAnsi="Consolas"/>
+          <w:sz w:val="20"/>
+        </w:rPr>
+        <w:t>.doc</w:t>
+      </w:r>
+      <w:r>
+        <w:t xml:space="preserve">/сложно оформленных </w:t>
+      </w:r>
+      <w:r>
+        <w:rPr>
+          <w:rFonts w:ascii="Consolas" w:hAnsi="Consolas"/>
+          <w:sz w:val="20"/>
+        </w:rPr>
+        <w:t>.docx</w:t>
+      </w:r>
+      <w:r>
+        <w:t xml:space="preserve"> источником более широкого класса подобных «немотивированных» ошибок retrieval в проде.</w:t>
+      </w:r>
+    </w:p>
+    <w:p>
+      <w:r>
+        <w:t>---</w:t>
       </w:r>
     </w:p>
     <w:p>
@@ -833,35 +1382,60 @@
       </w:r>
     </w:p>
     <w:p>
-      <w:pPr>
-        <w:pStyle w:val="ListNumber"/>
-      </w:pPr>
       <w:r>
-        <w:t>Находка 1: подтвердить, что «поиск без ограничения при пустых чекбоксах коллекций» — ожидаемое поведение; рассмотреть более явную индикацию в UI чата.</w:t>
+        <w:t xml:space="preserve">1. </w:t>
+      </w:r>
+      <w:r>
+        <w:rPr>
+          <w:b/>
+        </w:rPr>
+        <w:t>Находка 1:</w:t>
+      </w:r>
+      <w:r>
+        <w:t xml:space="preserve"> подтвердить, что «поиск без ограничения при пустых чекбоксах коллекций» — ожидаемое поведение; рассмотреть более явную индикацию в UI чата.</w:t>
       </w:r>
     </w:p>
     <w:p>
-      <w:pPr>
-        <w:pStyle w:val="ListNumber"/>
-      </w:pPr>
       <w:r>
-        <w:t>Находка 2 (приоритет): разобраться, почему карточка источника систематически не совпадает с реальным источником ответа — начать с вопроса 2.3 («глоссарий», воспроизводится трижды на одном вопросе) и выяснить природу самого документа «глоссарий» (почему недоступен, откуда берётся).</w:t>
+        <w:t xml:space="preserve">2. </w:t>
+      </w:r>
+      <w:r>
+        <w:rPr>
+          <w:b/>
+        </w:rPr>
+        <w:t>Находка 2 (приоритет):</w:t>
+      </w:r>
+      <w:r>
+        <w:t xml:space="preserve"> разобраться, почему карточка источника систематически не совпадает с реальным источником ответа — начать с вопроса 2.3 («глоссарий», воспроизводится трижды на одном вопросе) и выяснить природу самого документа «глоссарий» (почему недоступен, откуда берётся).</w:t>
       </w:r>
     </w:p>
     <w:p>
-      <w:pPr>
-        <w:pStyle w:val="ListNumber"/>
-      </w:pPr>
       <w:r>
-        <w:t>Находка 3: сверить пайплайн обработки исходных файлов «для теста ИИ (1)» (07.07.2026) с нашим пайплайном переконвертации — понять, что конкретно изменилось и почему это чинит retrieval для этих трёх документов.</w:t>
+        <w:t xml:space="preserve">3. </w:t>
+      </w:r>
+      <w:r>
+        <w:rPr>
+          <w:b/>
+        </w:rPr>
+        <w:t>Находка 3:</w:t>
+      </w:r>
+      <w:r>
+        <w:t xml:space="preserve"> сверить пайплайн обработки исходных файлов </w:t>
+      </w:r>
+      <w:r>
+        <w:rPr>
+          <w:rFonts w:ascii="Consolas" w:hAnsi="Consolas"/>
+          <w:sz w:val="20"/>
+        </w:rPr>
+        <w:t>для теста ИИ (1)</w:t>
+      </w:r>
+      <w:r>
+        <w:t xml:space="preserve"> (07.07.2026) с нашим пайплайном переконвертации — понять, что конкретно изменилось и почему это чинит retrieval для этих трёх документов.</w:t>
       </w:r>
     </w:p>
     <w:p>
-      <w:pPr>
-        <w:pStyle w:val="ListNumber"/>
-      </w:pPr>
       <w:r>
-        <w:t>После ответа по находкам 1–2 — сообщить нам, чтобы продолжить полный цикл теста (осталась перепроверка прохода B — SQL/каталог выключен, — не проводившаяся сегодня).</w:t>
+        <w:t>4. После ответа по находкам 1–2 — сообщить нам, чтобы продолжить полный цикл теста (осталась перепроверка прохода B — SQL/каталог выключен, — не проводившаяся сегодня).</w:t>
       </w:r>
     </w:p>
     <w:sectPr>

</xml_diff>